<commit_message>
Implemented Global Exception Handling and Logging
</commit_message>
<xml_diff>
--- a/notes.docx
+++ b/notes.docx
@@ -106,6 +106,62 @@
     </w:p>
     <w:p>
       <w:pPr>
+        <w:pStyle w:val="ListParagraph"/>
+        <w:numPr>
+          <w:ilvl w:val="0"/>
+          <w:numId w:val="1"/>
+        </w:numPr>
+        <w:rPr>
+          <w:sz w:val="24"/>
+          <w:szCs w:val="24"/>
+        </w:rPr>
+      </w:pPr>
+      <w:proofErr w:type="spellStart"/>
+      <w:r>
+        <w:rPr>
+          <w:sz w:val="24"/>
+          <w:szCs w:val="24"/>
+        </w:rPr>
+        <w:t>RequestDelegate</w:t>
+      </w:r>
+      <w:proofErr w:type="spellEnd"/>
+      <w:r>
+        <w:rPr>
+          <w:sz w:val="24"/>
+          <w:szCs w:val="24"/>
+        </w:rPr>
+        <w:t xml:space="preserve"> represents the next component in the ASP.NET Core request pipeline.</w:t>
+      </w:r>
+      <w:r>
+        <w:rPr>
+          <w:sz w:val="24"/>
+          <w:szCs w:val="24"/>
+        </w:rPr>
+        <w:t xml:space="preserve"> </w:t>
+      </w:r>
+      <w:r>
+        <w:rPr>
+          <w:sz w:val="24"/>
+          <w:szCs w:val="24"/>
+        </w:rPr>
+        <w:t>Without it, this middleware cannot continue processing the request.</w:t>
+      </w:r>
+    </w:p>
+    <w:p>
+      <w:pPr>
+        <w:pStyle w:val="ListParagraph"/>
+        <w:numPr>
+          <w:ilvl w:val="0"/>
+          <w:numId w:val="1"/>
+        </w:numPr>
+        <w:rPr>
+          <w:sz w:val="24"/>
+          <w:szCs w:val="24"/>
+        </w:rPr>
+      </w:pPr>
+    </w:p>
+    <w:p>
+      <w:pPr>
         <w:rPr>
           <w:b/>
           <w:bCs/>
@@ -118,6 +174,9 @@
       <w:r>
         <w:t>Request comes in</w:t>
       </w:r>
+      <w:r>
+        <w:t xml:space="preserve">                                                                  </w:t>
+      </w:r>
     </w:p>
     <w:p>
       <w:r>
@@ -223,6 +282,477 @@
         <w:t>Continue   Log + Return 500</w:t>
       </w:r>
     </w:p>
+    <w:p/>
+    <w:p/>
+    <w:p/>
+    <w:p/>
+    <w:p/>
+    <w:p/>
+    <w:p/>
+    <w:p/>
+    <w:tbl>
+      <w:tblPr>
+        <w:tblStyle w:val="TableGrid"/>
+        <w:tblW w:w="9222" w:type="dxa"/>
+        <w:tblBorders>
+          <w:top w:val="none" w:sz="0" w:space="0" w:color="auto"/>
+          <w:left w:val="none" w:sz="0" w:space="0" w:color="auto"/>
+          <w:bottom w:val="none" w:sz="0" w:space="0" w:color="auto"/>
+          <w:right w:val="none" w:sz="0" w:space="0" w:color="auto"/>
+          <w:insideH w:val="none" w:sz="0" w:space="0" w:color="auto"/>
+          <w:insideV w:val="none" w:sz="0" w:space="0" w:color="auto"/>
+        </w:tblBorders>
+        <w:tblLook w:val="04A0" w:firstRow="1" w:lastRow="0" w:firstColumn="1" w:lastColumn="0" w:noHBand="0" w:noVBand="1"/>
+      </w:tblPr>
+      <w:tblGrid>
+        <w:gridCol w:w="4611"/>
+        <w:gridCol w:w="4611"/>
+      </w:tblGrid>
+      <w:tr>
+        <w:trPr>
+          <w:trHeight w:val="5006"/>
+        </w:trPr>
+        <w:tc>
+          <w:tcPr>
+            <w:tcW w:w="4611" w:type="dxa"/>
+          </w:tcPr>
+          <w:p>
+            <w:r>
+              <w:lastRenderedPageBreak/>
+              <w:t>Request</w:t>
+            </w:r>
+            <w:r>
+              <w:tab/>
+            </w:r>
+            <w:r>
+              <w:tab/>
+            </w:r>
+            <w:r>
+              <w:tab/>
+            </w:r>
+            <w:r>
+              <w:tab/>
+            </w:r>
+            <w:r>
+              <w:tab/>
+            </w:r>
+            <w:r>
+              <w:tab/>
+            </w:r>
+          </w:p>
+          <w:p>
+            <w:r>
+              <w:t>↓</w:t>
+            </w:r>
+          </w:p>
+          <w:p>
+            <w:proofErr w:type="spellStart"/>
+            <w:r>
+              <w:t>ExceptionHandlingMiddleware</w:t>
+            </w:r>
+            <w:proofErr w:type="spellEnd"/>
+          </w:p>
+          <w:p>
+            <w:r>
+              <w:t>↓</w:t>
+            </w:r>
+          </w:p>
+          <w:p>
+            <w:r>
+              <w:t>await _next(context)</w:t>
+            </w:r>
+          </w:p>
+          <w:p>
+            <w:r>
+              <w:t>↓</w:t>
+            </w:r>
+          </w:p>
+          <w:p>
+            <w:proofErr w:type="spellStart"/>
+            <w:r>
+              <w:t>EmployeeController</w:t>
+            </w:r>
+            <w:proofErr w:type="spellEnd"/>
+          </w:p>
+          <w:p>
+            <w:r>
+              <w:t>↓</w:t>
+            </w:r>
+          </w:p>
+          <w:p>
+            <w:proofErr w:type="spellStart"/>
+            <w:r>
+              <w:t>EmployeeRepository</w:t>
+            </w:r>
+            <w:proofErr w:type="spellEnd"/>
+          </w:p>
+          <w:p>
+            <w:r>
+              <w:t>↓</w:t>
+            </w:r>
+          </w:p>
+          <w:p>
+            <w:r>
+              <w:t>SQL Server</w:t>
+            </w:r>
+          </w:p>
+          <w:p/>
+        </w:tc>
+        <w:tc>
+          <w:tcPr>
+            <w:tcW w:w="4611" w:type="dxa"/>
+          </w:tcPr>
+          <w:p>
+            <w:r>
+              <w:t>ASP.NET Core starts</w:t>
+            </w:r>
+          </w:p>
+          <w:p/>
+          <w:p>
+            <w:r>
+              <w:t>↓</w:t>
+            </w:r>
+          </w:p>
+          <w:p/>
+          <w:p>
+            <w:r>
+              <w:t>Creates Logger</w:t>
+            </w:r>
+          </w:p>
+          <w:p/>
+          <w:p>
+            <w:r>
+              <w:t>↓</w:t>
+            </w:r>
+          </w:p>
+          <w:p/>
+          <w:p>
+            <w:r>
+              <w:t>Knows next middleware</w:t>
+            </w:r>
+          </w:p>
+          <w:p/>
+          <w:p>
+            <w:r>
+              <w:t>↓</w:t>
+            </w:r>
+          </w:p>
+          <w:p/>
+          <w:p>
+            <w:r>
+              <w:t>Calls constructor</w:t>
+            </w:r>
+          </w:p>
+          <w:p/>
+          <w:p>
+            <w:r>
+              <w:t>↓</w:t>
+            </w:r>
+          </w:p>
+          <w:p/>
+          <w:p>
+            <w:r>
+              <w:t xml:space="preserve">new </w:t>
+            </w:r>
+            <w:proofErr w:type="spellStart"/>
+            <w:proofErr w:type="gramStart"/>
+            <w:r>
+              <w:t>ExceptionHandlingMiddleware</w:t>
+            </w:r>
+            <w:proofErr w:type="spellEnd"/>
+            <w:r>
+              <w:t>(</w:t>
+            </w:r>
+            <w:proofErr w:type="gramEnd"/>
+            <w:r>
+              <w:t>next, logger)</w:t>
+            </w:r>
+          </w:p>
+          <w:p/>
+          <w:p>
+            <w:r>
+              <w:t xml:space="preserve">we don’t need to create </w:t>
+            </w:r>
+            <w:proofErr w:type="gramStart"/>
+            <w:r>
+              <w:t>object,</w:t>
+            </w:r>
+            <w:proofErr w:type="gramEnd"/>
+            <w:r>
+              <w:t xml:space="preserve"> ASP .NET core does</w:t>
+            </w:r>
+          </w:p>
+        </w:tc>
+      </w:tr>
+    </w:tbl>
+    <w:p/>
+    <w:p>
+      <w:r>
+        <w:rPr>
+          <w:b/>
+          <w:bCs/>
+        </w:rPr>
+        <w:t xml:space="preserve">Why do we use private </w:t>
+      </w:r>
+      <w:proofErr w:type="spellStart"/>
+      <w:r>
+        <w:rPr>
+          <w:b/>
+          <w:bCs/>
+        </w:rPr>
+        <w:t>readonly</w:t>
+      </w:r>
+      <w:proofErr w:type="spellEnd"/>
+      <w:r>
+        <w:rPr>
+          <w:b/>
+          <w:bCs/>
+        </w:rPr>
+        <w:t xml:space="preserve"> for injected dependencies?</w:t>
+      </w:r>
+      <w:r>
+        <w:br/>
+        <w:t xml:space="preserve">Ans: </w:t>
+      </w:r>
+      <w:r>
+        <w:t xml:space="preserve">Dependencies injected through the constructor are required for the lifetime of the object. Making them </w:t>
+      </w:r>
+      <w:r>
+        <w:rPr>
+          <w:i/>
+          <w:iCs/>
+        </w:rPr>
+        <w:t>private</w:t>
+      </w:r>
+      <w:r>
+        <w:t xml:space="preserve"> enforces encapsulation, and </w:t>
+      </w:r>
+      <w:proofErr w:type="spellStart"/>
+      <w:r>
+        <w:rPr>
+          <w:i/>
+          <w:iCs/>
+        </w:rPr>
+        <w:t>readonly</w:t>
+      </w:r>
+      <w:proofErr w:type="spellEnd"/>
+      <w:r>
+        <w:t xml:space="preserve"> ensures they cannot be accidentally reassigned after construction, resulting in safer and more predictable code.</w:t>
+      </w:r>
+    </w:p>
+    <w:p/>
+    <w:p>
+      <w:r>
+        <w:rPr>
+          <w:b/>
+          <w:bCs/>
+        </w:rPr>
+        <w:t xml:space="preserve">Why isn't </w:t>
+      </w:r>
+      <w:proofErr w:type="spellStart"/>
+      <w:r>
+        <w:rPr>
+          <w:b/>
+          <w:bCs/>
+        </w:rPr>
+        <w:t>RequestDelegate</w:t>
+      </w:r>
+      <w:proofErr w:type="spellEnd"/>
+      <w:r>
+        <w:rPr>
+          <w:b/>
+          <w:bCs/>
+        </w:rPr>
+        <w:t xml:space="preserve"> a normal DI service</w:t>
+      </w:r>
+      <w:r>
+        <w:rPr>
+          <w:b/>
+          <w:bCs/>
+        </w:rPr>
+        <w:t>?</w:t>
+      </w:r>
+    </w:p>
+    <w:p>
+      <w:r>
+        <w:t xml:space="preserve">Ans: </w:t>
+      </w:r>
+      <w:proofErr w:type="spellStart"/>
+      <w:r>
+        <w:t>RequestDelegate</w:t>
+      </w:r>
+      <w:proofErr w:type="spellEnd"/>
+      <w:r>
+        <w:t xml:space="preserve"> is not a reusable application service like </w:t>
+      </w:r>
+      <w:proofErr w:type="spellStart"/>
+      <w:r>
+        <w:t>ILogger</w:t>
+      </w:r>
+      <w:proofErr w:type="spellEnd"/>
+      <w:r>
+        <w:t xml:space="preserve"> or </w:t>
+      </w:r>
+      <w:proofErr w:type="spellStart"/>
+      <w:r>
+        <w:t>IConfiguration</w:t>
+      </w:r>
+      <w:proofErr w:type="spellEnd"/>
+      <w:r>
+        <w:t xml:space="preserve">. It represents the next component in the current HTTP request pipeline. Since each middleware has a different 'next' component, ASP.NET Core constructs and supplies the appropriate </w:t>
+      </w:r>
+      <w:proofErr w:type="spellStart"/>
+      <w:r>
+        <w:t>RequestDelegate</w:t>
+      </w:r>
+      <w:proofErr w:type="spellEnd"/>
+      <w:r>
+        <w:t xml:space="preserve"> while building the middleware pipeline rather than resolving it from the dependency injection container.</w:t>
+      </w:r>
+    </w:p>
+    <w:p>
+      <w:pPr>
+        <w:rPr>
+          <w:b/>
+          <w:bCs/>
+        </w:rPr>
+      </w:pPr>
+      <w:r>
+        <w:rPr>
+          <w:b/>
+          <w:bCs/>
+        </w:rPr>
+        <w:t>Why ‘await _next(context)’?</w:t>
+      </w:r>
+    </w:p>
+    <w:p>
+      <w:r>
+        <w:t>Without await, the middleware starts executing the next component but immediately continues without waiting for it to finish. As a result, any exception thrown later in the pipeline won't be observed by this try-catch. Using await ensures that the middleware waits for the downstream pipeline to complete, allowing exceptions to propagate back and be caught."</w:t>
+      </w:r>
+    </w:p>
+    <w:p>
+      <w:r>
+        <w:rPr>
+          <w:b/>
+          <w:bCs/>
+        </w:rPr>
+        <w:t xml:space="preserve">Why set the </w:t>
+      </w:r>
+      <w:proofErr w:type="spellStart"/>
+      <w:r>
+        <w:rPr>
+          <w:b/>
+          <w:bCs/>
+        </w:rPr>
+        <w:t>ContentType</w:t>
+      </w:r>
+      <w:proofErr w:type="spellEnd"/>
+      <w:r>
+        <w:rPr>
+          <w:b/>
+          <w:bCs/>
+        </w:rPr>
+        <w:t xml:space="preserve"> explicitly?</w:t>
+      </w:r>
+    </w:p>
+    <w:p>
+      <w:r>
+        <w:t xml:space="preserve">Setting </w:t>
+      </w:r>
+      <w:proofErr w:type="spellStart"/>
+      <w:r>
+        <w:t>ContentType</w:t>
+      </w:r>
+      <w:proofErr w:type="spellEnd"/>
+      <w:r>
+        <w:t xml:space="preserve"> ensures the client knows how to interpret the response body. Since our API returns JSON, we specify application/</w:t>
+      </w:r>
+      <w:proofErr w:type="spellStart"/>
+      <w:r>
+        <w:t>json</w:t>
+      </w:r>
+      <w:proofErr w:type="spellEnd"/>
+      <w:r>
+        <w:t xml:space="preserve"> so clients can correctly deserialize the response."</w:t>
+      </w:r>
+    </w:p>
+    <w:p/>
+    <w:p>
+      <w:r>
+        <w:rPr>
+          <w:b/>
+          <w:bCs/>
+        </w:rPr>
+        <w:t>Global Exception middleware:</w:t>
+      </w:r>
+      <w:r>
+        <w:t xml:space="preserve"> </w:t>
+      </w:r>
+      <w:r>
+        <w:t>Convert Exception → HTTP Response</w:t>
+      </w:r>
+    </w:p>
+    <w:p/>
+    <w:p>
+      <w:r>
+        <w:rPr>
+          <w:b/>
+          <w:bCs/>
+        </w:rPr>
+        <w:lastRenderedPageBreak/>
+        <w:t xml:space="preserve">Why use </w:t>
+      </w:r>
+      <w:proofErr w:type="spellStart"/>
+      <w:r>
+        <w:rPr>
+          <w:b/>
+          <w:bCs/>
+        </w:rPr>
+        <w:t>DateTime.UtcNow</w:t>
+      </w:r>
+      <w:proofErr w:type="spellEnd"/>
+      <w:r>
+        <w:rPr>
+          <w:b/>
+          <w:bCs/>
+        </w:rPr>
+        <w:t xml:space="preserve"> instead of </w:t>
+      </w:r>
+      <w:proofErr w:type="spellStart"/>
+      <w:r>
+        <w:rPr>
+          <w:b/>
+          <w:bCs/>
+        </w:rPr>
+        <w:t>DateTime.Now</w:t>
+      </w:r>
+      <w:proofErr w:type="spellEnd"/>
+      <w:r>
+        <w:rPr>
+          <w:b/>
+          <w:bCs/>
+        </w:rPr>
+        <w:t xml:space="preserve"> in production?</w:t>
+      </w:r>
+    </w:p>
+    <w:p>
+      <w:proofErr w:type="spellStart"/>
+      <w:r>
+        <w:t>DateTime.UtcNow</w:t>
+      </w:r>
+      <w:proofErr w:type="spellEnd"/>
+      <w:r>
+        <w:t xml:space="preserve"> provides a consistent, time zone-independent timestamp. In distributed systems where servers may run in different regions, using UTC makes logs easier to correlate and avoids issues caused by local time zones or </w:t>
+      </w:r>
+      <w:r>
+        <w:t>daylight-saving</w:t>
+      </w:r>
+      <w:r>
+        <w:t xml:space="preserve"> time. If a user needs local time, we can convert UTC to their time zone when displaying it.</w:t>
+      </w:r>
+    </w:p>
+    <w:p/>
+    <w:p/>
     <w:sectPr>
       <w:pgSz w:w="11906" w:h="16838"/>
       <w:pgMar w:top="1440" w:right="1440" w:bottom="1440" w:left="1440" w:header="708" w:footer="708" w:gutter="0"/>
@@ -231,6 +761,127 @@
     </w:sectPr>
   </w:body>
 </w:document>
+</file>
+
+<file path=word/numbering.xml><?xml version="1.0" encoding="utf-8"?>
+<w:numbering xmlns:wpc="http://schemas.microsoft.com/office/word/2010/wordprocessingCanvas" xmlns:cx="http://schemas.microsoft.com/office/drawing/2014/chartex" xmlns:cx1="http://schemas.microsoft.com/office/drawing/2015/9/8/chartex" xmlns:cx2="http://schemas.microsoft.com/office/drawing/2015/10/21/chartex" xmlns:cx3="http://schemas.microsoft.com/office/drawing/2016/5/9/chartex" xmlns:cx4="http://schemas.microsoft.com/office/drawing/2016/5/10/chartex" xmlns:cx5="http://schemas.microsoft.com/office/drawing/2016/5/11/chartex" xmlns:cx6="http://schemas.microsoft.com/office/drawing/2016/5/12/chartex" xmlns:cx7="http://schemas.microsoft.com/office/drawing/2016/5/13/chartex" xmlns:cx8="http://schemas.microsoft.com/office/drawing/2016/5/14/chartex" xmlns:mc="http://schemas.openxmlformats.org/markup-compatibility/2006" xmlns:aink="http://schemas.microsoft.com/office/drawing/2016/ink" xmlns:am3d="http://schemas.microsoft.com/office/drawing/2017/model3d" xmlns:o="urn:schemas-microsoft-com:office:office" xmlns:oel="http://schemas.microsoft.com/office/2019/extlst" xmlns:r="http://schemas.openxmlformats.org/officeDocument/2006/relationships" xmlns:m="http://schemas.openxmlformats.org/officeDocument/2006/math" xmlns:v="urn:schemas-microsoft-com:vml" xmlns:wp14="http://schemas.microsoft.com/office/word/2010/wordprocessingDrawing" xmlns:wp="http://schemas.openxmlformats.org/drawingml/2006/wordprocessingDrawing" xmlns:w10="urn:schemas-microsoft-com:office:word" xmlns:w="http://schemas.openxmlformats.org/wordprocessingml/2006/main" xmlns:w14="http://schemas.microsoft.com/office/word/2010/wordml" xmlns:w15="http://schemas.microsoft.com/office/word/2012/wordml" xmlns:w16cex="http://schemas.microsoft.com/office/word/2018/wordml/cex" xmlns:w16cid="http://schemas.microsoft.com/office/word/2016/wordml/cid" xmlns:w16="http://schemas.microsoft.com/office/word/2018/wordml" xmlns:w16du="http://schemas.microsoft.com/office/word/2023/wordml/word16du" xmlns:w16sdtdh="http://schemas.microsoft.com/office/word/2020/wordml/sdtdatahash" xmlns:w16sdtfl="http://schemas.microsoft.com/office/word/2024/wordml/sdtformatlock" xmlns:w16se="http://schemas.microsoft.com/office/word/2015/wordml/symex" xmlns:wpg="http://schemas.microsoft.com/office/word/2010/wordprocessingGroup" xmlns:wpi="http://schemas.microsoft.com/office/word/2010/wordprocessingInk" xmlns:wne="http://schemas.microsoft.com/office/word/2006/wordml" xmlns:wps="http://schemas.microsoft.com/office/word/2010/wordprocessingShape" mc:Ignorable="w14 w15 w16se w16cid w16 w16cex w16sdtdh w16sdtfl w16du wp14">
+  <w:abstractNum w:abstractNumId="0" w15:restartNumberingAfterBreak="0">
+    <w:nsid w:val="707E5912"/>
+    <w:multiLevelType w:val="hybridMultilevel"/>
+    <w:tmpl w:val="83E8DC70"/>
+    <w:lvl w:ilvl="0" w:tplc="40090001">
+      <w:start w:val="1"/>
+      <w:numFmt w:val="bullet"/>
+      <w:lvlText w:val=""/>
+      <w:lvlJc w:val="left"/>
+      <w:pPr>
+        <w:ind w:left="720" w:hanging="360"/>
+      </w:pPr>
+      <w:rPr>
+        <w:rFonts w:ascii="Symbol" w:hAnsi="Symbol" w:hint="default"/>
+      </w:rPr>
+    </w:lvl>
+    <w:lvl w:ilvl="1" w:tplc="40090003" w:tentative="1">
+      <w:start w:val="1"/>
+      <w:numFmt w:val="bullet"/>
+      <w:lvlText w:val="o"/>
+      <w:lvlJc w:val="left"/>
+      <w:pPr>
+        <w:ind w:left="1440" w:hanging="360"/>
+      </w:pPr>
+      <w:rPr>
+        <w:rFonts w:ascii="Courier New" w:hAnsi="Courier New" w:cs="Courier New" w:hint="default"/>
+      </w:rPr>
+    </w:lvl>
+    <w:lvl w:ilvl="2" w:tplc="40090005" w:tentative="1">
+      <w:start w:val="1"/>
+      <w:numFmt w:val="bullet"/>
+      <w:lvlText w:val=""/>
+      <w:lvlJc w:val="left"/>
+      <w:pPr>
+        <w:ind w:left="2160" w:hanging="360"/>
+      </w:pPr>
+      <w:rPr>
+        <w:rFonts w:ascii="Wingdings" w:hAnsi="Wingdings" w:hint="default"/>
+      </w:rPr>
+    </w:lvl>
+    <w:lvl w:ilvl="3" w:tplc="40090001" w:tentative="1">
+      <w:start w:val="1"/>
+      <w:numFmt w:val="bullet"/>
+      <w:lvlText w:val=""/>
+      <w:lvlJc w:val="left"/>
+      <w:pPr>
+        <w:ind w:left="2880" w:hanging="360"/>
+      </w:pPr>
+      <w:rPr>
+        <w:rFonts w:ascii="Symbol" w:hAnsi="Symbol" w:hint="default"/>
+      </w:rPr>
+    </w:lvl>
+    <w:lvl w:ilvl="4" w:tplc="40090003" w:tentative="1">
+      <w:start w:val="1"/>
+      <w:numFmt w:val="bullet"/>
+      <w:lvlText w:val="o"/>
+      <w:lvlJc w:val="left"/>
+      <w:pPr>
+        <w:ind w:left="3600" w:hanging="360"/>
+      </w:pPr>
+      <w:rPr>
+        <w:rFonts w:ascii="Courier New" w:hAnsi="Courier New" w:cs="Courier New" w:hint="default"/>
+      </w:rPr>
+    </w:lvl>
+    <w:lvl w:ilvl="5" w:tplc="40090005" w:tentative="1">
+      <w:start w:val="1"/>
+      <w:numFmt w:val="bullet"/>
+      <w:lvlText w:val=""/>
+      <w:lvlJc w:val="left"/>
+      <w:pPr>
+        <w:ind w:left="4320" w:hanging="360"/>
+      </w:pPr>
+      <w:rPr>
+        <w:rFonts w:ascii="Wingdings" w:hAnsi="Wingdings" w:hint="default"/>
+      </w:rPr>
+    </w:lvl>
+    <w:lvl w:ilvl="6" w:tplc="40090001" w:tentative="1">
+      <w:start w:val="1"/>
+      <w:numFmt w:val="bullet"/>
+      <w:lvlText w:val=""/>
+      <w:lvlJc w:val="left"/>
+      <w:pPr>
+        <w:ind w:left="5040" w:hanging="360"/>
+      </w:pPr>
+      <w:rPr>
+        <w:rFonts w:ascii="Symbol" w:hAnsi="Symbol" w:hint="default"/>
+      </w:rPr>
+    </w:lvl>
+    <w:lvl w:ilvl="7" w:tplc="40090003" w:tentative="1">
+      <w:start w:val="1"/>
+      <w:numFmt w:val="bullet"/>
+      <w:lvlText w:val="o"/>
+      <w:lvlJc w:val="left"/>
+      <w:pPr>
+        <w:ind w:left="5760" w:hanging="360"/>
+      </w:pPr>
+      <w:rPr>
+        <w:rFonts w:ascii="Courier New" w:hAnsi="Courier New" w:cs="Courier New" w:hint="default"/>
+      </w:rPr>
+    </w:lvl>
+    <w:lvl w:ilvl="8" w:tplc="40090005" w:tentative="1">
+      <w:start w:val="1"/>
+      <w:numFmt w:val="bullet"/>
+      <w:lvlText w:val=""/>
+      <w:lvlJc w:val="left"/>
+      <w:pPr>
+        <w:ind w:left="6480" w:hanging="360"/>
+      </w:pPr>
+      <w:rPr>
+        <w:rFonts w:ascii="Wingdings" w:hAnsi="Wingdings" w:hint="default"/>
+      </w:rPr>
+    </w:lvl>
+  </w:abstractNum>
+  <w:num w:numId="1" w16cid:durableId="534733182">
+    <w:abstractNumId w:val="0"/>
+  </w:num>
+</w:numbering>
 </file>
 
 <file path=word/styles.xml><?xml version="1.0" encoding="utf-8"?>
@@ -1149,6 +1800,25 @@
       <w:spacing w:val="5"/>
     </w:rPr>
   </w:style>
+  <w:style w:type="table" w:styleId="TableGrid">
+    <w:name w:val="Table Grid"/>
+    <w:basedOn w:val="TableNormal"/>
+    <w:uiPriority w:val="39"/>
+    <w:rsid w:val="00757BDD"/>
+    <w:pPr>
+      <w:spacing w:after="0" w:line="240" w:lineRule="auto"/>
+    </w:pPr>
+    <w:tblPr>
+      <w:tblBorders>
+        <w:top w:val="single" w:sz="4" w:space="0" w:color="auto"/>
+        <w:left w:val="single" w:sz="4" w:space="0" w:color="auto"/>
+        <w:bottom w:val="single" w:sz="4" w:space="0" w:color="auto"/>
+        <w:right w:val="single" w:sz="4" w:space="0" w:color="auto"/>
+        <w:insideH w:val="single" w:sz="4" w:space="0" w:color="auto"/>
+        <w:insideV w:val="single" w:sz="4" w:space="0" w:color="auto"/>
+      </w:tblBorders>
+    </w:tblPr>
+  </w:style>
 </w:styles>
 </file>
 

</xml_diff>

<commit_message>
Added cancellation token to each method in Repository method and in controller
</commit_message>
<xml_diff>
--- a/notes.docx
+++ b/notes.docx
@@ -1,6 +1,6 @@
 
 <file path=word/document.xml><?xml version="1.0" encoding="utf-8"?>
-<w:document xmlns:wpc="http://schemas.microsoft.com/office/word/2010/wordprocessingCanvas" xmlns:cx="http://schemas.microsoft.com/office/drawing/2014/chartex" xmlns:cx1="http://schemas.microsoft.com/office/drawing/2015/9/8/chartex" xmlns:cx2="http://schemas.microsoft.com/office/drawing/2015/10/21/chartex" xmlns:cx3="http://schemas.microsoft.com/office/drawing/2016/5/9/chartex" xmlns:cx4="http://schemas.microsoft.com/office/drawing/2016/5/10/chartex" xmlns:cx5="http://schemas.microsoft.com/office/drawing/2016/5/11/chartex" xmlns:cx6="http://schemas.microsoft.com/office/drawing/2016/5/12/chartex" xmlns:cx7="http://schemas.microsoft.com/office/drawing/2016/5/13/chartex" xmlns:cx8="http://schemas.microsoft.com/office/drawing/2016/5/14/chartex" xmlns:mc="http://schemas.openxmlformats.org/markup-compatibility/2006" xmlns:aink="http://schemas.microsoft.com/office/drawing/2016/ink" xmlns:am3d="http://schemas.microsoft.com/office/drawing/2017/model3d" xmlns:o="urn:schemas-microsoft-com:office:office" xmlns:oel="http://schemas.microsoft.com/office/2019/extlst" xmlns:r="http://schemas.openxmlformats.org/officeDocument/2006/relationships" xmlns:m="http://schemas.openxmlformats.org/officeDocument/2006/math" xmlns:v="urn:schemas-microsoft-com:vml" xmlns:wp14="http://schemas.microsoft.com/office/word/2010/wordprocessingDrawing" xmlns:wp="http://schemas.openxmlformats.org/drawingml/2006/wordprocessingDrawing" xmlns:w10="urn:schemas-microsoft-com:office:word" xmlns:w="http://schemas.openxmlformats.org/wordprocessingml/2006/main" xmlns:w14="http://schemas.microsoft.com/office/word/2010/wordml" xmlns:w15="http://schemas.microsoft.com/office/word/2012/wordml" xmlns:w16cex="http://schemas.microsoft.com/office/word/2018/wordml/cex" xmlns:w16cid="http://schemas.microsoft.com/office/word/2016/wordml/cid" xmlns:w16="http://schemas.microsoft.com/office/word/2018/wordml" xmlns:w16du="http://schemas.microsoft.com/office/word/2023/wordml/word16du" xmlns:w16sdtdh="http://schemas.microsoft.com/office/word/2020/wordml/sdtdatahash" xmlns:w16sdtfl="http://schemas.microsoft.com/office/word/2024/wordml/sdtformatlock" xmlns:w16se="http://schemas.microsoft.com/office/word/2015/wordml/symex" xmlns:wpg="http://schemas.microsoft.com/office/word/2010/wordprocessingGroup" xmlns:wpi="http://schemas.microsoft.com/office/word/2010/wordprocessingInk" xmlns:wne="http://schemas.microsoft.com/office/word/2006/wordml" xmlns:wps="http://schemas.microsoft.com/office/word/2010/wordprocessingShape" mc:Ignorable="w14 w15 w16se w16cid w16 w16cex w16sdtdh w16sdtfl w16du wp14">
+<w:document xmlns:wpc="http://schemas.microsoft.com/office/word/2010/wordprocessingCanvas" xmlns:cx="http://schemas.microsoft.com/office/drawing/2014/chartex" xmlns:cx1="http://schemas.microsoft.com/office/drawing/2015/9/8/chartex" xmlns:cx2="http://schemas.microsoft.com/office/drawing/2015/10/21/chartex" xmlns:cx3="http://schemas.microsoft.com/office/drawing/2016/5/9/chartex" xmlns:cx4="http://schemas.microsoft.com/office/drawing/2016/5/10/chartex" xmlns:cx5="http://schemas.microsoft.com/office/drawing/2016/5/11/chartex" xmlns:cx6="http://schemas.microsoft.com/office/drawing/2016/5/12/chartex" xmlns:cx7="http://schemas.microsoft.com/office/drawing/2016/5/13/chartex" xmlns:cx8="http://schemas.microsoft.com/office/drawing/2016/5/14/chartex" xmlns:mc="http://schemas.openxmlformats.org/markup-compatibility/2006" xmlns:aink="http://schemas.microsoft.com/office/drawing/2016/ink" xmlns:am3d="http://schemas.microsoft.com/office/drawing/2017/model3d" xmlns:o="urn:schemas-microsoft-com:office:office" xmlns:oel="http://schemas.microsoft.com/office/2019/extlst" xmlns:r="http://schemas.openxmlformats.org/officeDocument/2006/relationships" xmlns:m="http://schemas.openxmlformats.org/officeDocument/2006/math" xmlns:v="urn:schemas-microsoft-com:vml" xmlns:wp14="http://schemas.microsoft.com/office/word/2010/wordprocessingDrawing" xmlns:wp="http://schemas.openxmlformats.org/drawingml/2006/wordprocessingDrawing" xmlns:w10="urn:schemas-microsoft-com:office:word" xmlns:w="http://schemas.openxmlformats.org/wordprocessingml/2006/main" xmlns:w14="http://schemas.microsoft.com/office/word/2010/wordml" xmlns:w15="http://schemas.microsoft.com/office/word/2012/wordml" xmlns:w16cei="http://schemas.microsoft.com/office/word/2026/wordml/cei" xmlns:w16cex="http://schemas.microsoft.com/office/word/2018/wordml/cex" xmlns:w16cid="http://schemas.microsoft.com/office/word/2016/wordml/cid" xmlns:w16="http://schemas.microsoft.com/office/word/2018/wordml" xmlns:w16du="http://schemas.microsoft.com/office/word/2023/wordml/word16du" xmlns:w16sdtdh="http://schemas.microsoft.com/office/word/2020/wordml/sdtdatahash" xmlns:w16sdtfl="http://schemas.microsoft.com/office/word/2024/wordml/sdtformatlock" xmlns:w16se="http://schemas.microsoft.com/office/word/2015/wordml/symex" xmlns:wpg="http://schemas.microsoft.com/office/word/2010/wordprocessingGroup" xmlns:wpi="http://schemas.microsoft.com/office/word/2010/wordprocessingInk" xmlns:wne="http://schemas.microsoft.com/office/word/2006/wordml" xmlns:wps="http://schemas.microsoft.com/office/word/2010/wordprocessingShape" mc:Ignorable="w14 w15 w16se w16cid w16 w16cex w16sdtdh w16sdtfl w16du wp14">
   <w:body>
     <w:p>
       <w:pPr>
@@ -42,14 +42,7 @@
           <w:b/>
           <w:bCs/>
         </w:rPr>
-        <w:t>E</w:t>
-      </w:r>
-      <w:r>
-        <w:rPr>
-          <w:b/>
-          <w:bCs/>
-        </w:rPr>
-        <w:t>very request must pass through the middleware.</w:t>
+        <w:t>Every request must pass through the middleware.</w:t>
       </w:r>
     </w:p>
     <w:p>
@@ -94,14 +87,7 @@
           <w:b/>
           <w:bCs/>
         </w:rPr>
-        <w:t>That's called loose couplin</w:t>
-      </w:r>
-      <w:r>
-        <w:rPr>
-          <w:b/>
-          <w:bCs/>
-        </w:rPr>
-        <w:t>g</w:t>
+        <w:t>That's called loose coupling</w:t>
       </w:r>
     </w:p>
     <w:p>
@@ -149,26 +135,56 @@
     </w:p>
     <w:p>
       <w:pPr>
-        <w:pStyle w:val="ListParagraph"/>
-        <w:numPr>
-          <w:ilvl w:val="0"/>
-          <w:numId w:val="1"/>
-        </w:numPr>
-        <w:rPr>
-          <w:sz w:val="24"/>
-          <w:szCs w:val="24"/>
+        <w:spacing w:before="100" w:beforeAutospacing="1" w:after="100" w:afterAutospacing="1" w:line="240" w:lineRule="auto"/>
+        <w:rPr>
+          <w:rFonts w:ascii="Times New Roman" w:eastAsia="Times New Roman" w:hAnsi="Times New Roman" w:cs="Times New Roman"/>
+          <w:b/>
+          <w:bCs/>
+          <w:kern w:val="0"/>
+          <w:lang w:eastAsia="en-IN"/>
+          <w14:ligatures w14:val="none"/>
         </w:rPr>
       </w:pPr>
     </w:p>
     <w:p>
       <w:pPr>
-        <w:rPr>
-          <w:b/>
-          <w:bCs/>
-          <w:sz w:val="32"/>
-          <w:szCs w:val="32"/>
+        <w:spacing w:before="100" w:beforeAutospacing="1" w:after="100" w:afterAutospacing="1" w:line="240" w:lineRule="auto"/>
+        <w:rPr>
+          <w:rFonts w:ascii="Times New Roman" w:eastAsia="Times New Roman" w:hAnsi="Times New Roman" w:cs="Times New Roman"/>
+          <w:kern w:val="0"/>
+          <w:lang w:eastAsia="en-IN"/>
+          <w14:ligatures w14:val="none"/>
         </w:rPr>
       </w:pPr>
+      <w:r>
+        <w:rPr>
+          <w:rFonts w:ascii="Times New Roman" w:eastAsia="Times New Roman" w:hAnsi="Times New Roman" w:cs="Times New Roman"/>
+          <w:b/>
+          <w:bCs/>
+          <w:kern w:val="0"/>
+          <w:lang w:eastAsia="en-IN"/>
+          <w14:ligatures w14:val="none"/>
+        </w:rPr>
+        <w:t>Global exception middleware should be one of the first middleware in the pipeline.</w:t>
+      </w:r>
+      <w:r>
+        <w:rPr>
+          <w:rFonts w:ascii="Times New Roman" w:eastAsia="Times New Roman" w:hAnsi="Times New Roman" w:cs="Times New Roman"/>
+          <w:kern w:val="0"/>
+          <w:lang w:eastAsia="en-IN"/>
+          <w14:ligatures w14:val="none"/>
+        </w:rPr>
+        <w:t xml:space="preserve"> </w:t>
+      </w:r>
+      <w:r>
+        <w:rPr>
+          <w:rFonts w:ascii="Times New Roman" w:eastAsia="Times New Roman" w:hAnsi="Times New Roman" w:cs="Times New Roman"/>
+          <w:kern w:val="0"/>
+          <w:lang w:eastAsia="en-IN"/>
+          <w14:ligatures w14:val="none"/>
+        </w:rPr>
+        <w:t>That way it can catch exceptions from almost everything that comes after it.</w:t>
+      </w:r>
     </w:p>
     <w:p>
       <w:r>
@@ -282,7 +298,6 @@
         <w:t>Continue   Log + Return 500</w:t>
       </w:r>
     </w:p>
-    <w:p/>
     <w:p/>
     <w:p/>
     <w:p/>
@@ -742,13 +757,97 @@
       </w:r>
       <w:proofErr w:type="spellEnd"/>
       <w:r>
-        <w:t xml:space="preserve"> provides a consistent, time zone-independent timestamp. In distributed systems where servers may run in different regions, using UTC makes logs easier to correlate and avoids issues caused by local time zones or </w:t>
-      </w:r>
-      <w:r>
-        <w:t>daylight-saving</w:t>
-      </w:r>
-      <w:r>
-        <w:t xml:space="preserve"> time. If a user needs local time, we can convert UTC to their time zone when displaying it.</w:t>
+        <w:t xml:space="preserve"> provides a consistent, time zone-independent timestamp. In distributed systems where servers may run in different regions, using UTC makes logs easier to correlate and avoids issues caused by local time zones or daylight-saving time. If a user needs local time, we can convert UTC to their time zone when displaying it.</w:t>
+      </w:r>
+    </w:p>
+    <w:p>
+      <w:r>
+        <w:rPr>
+          <w:b/>
+          <w:bCs/>
+        </w:rPr>
+        <w:t>Why should exception middleware be registered early in the pipeline?</w:t>
+      </w:r>
+    </w:p>
+    <w:p>
+      <w:r>
+        <w:t>Middleware can only catch exceptions thrown by components that execute after it in the request pipeline. Registering the global exception middleware early ensures it can handle exceptions from authentication, authorization, controllers, services, repositories, and other downstream middleware.</w:t>
+      </w:r>
+    </w:p>
+    <w:p>
+      <w:r>
+        <w:rPr>
+          <w:b/>
+          <w:bCs/>
+        </w:rPr>
+        <w:t xml:space="preserve">Why shouldn't a repository create its own </w:t>
+      </w:r>
+      <w:proofErr w:type="spellStart"/>
+      <w:r>
+        <w:rPr>
+          <w:b/>
+          <w:bCs/>
+        </w:rPr>
+        <w:t>CancellationToken</w:t>
+      </w:r>
+      <w:proofErr w:type="spellEnd"/>
+      <w:r>
+        <w:rPr>
+          <w:b/>
+          <w:bCs/>
+        </w:rPr>
+        <w:t>?</w:t>
+      </w:r>
+    </w:p>
+    <w:p>
+      <w:r>
+        <w:t xml:space="preserve">The repository doesn't own the lifetime of the HTTP request, so it shouldn't create its own </w:t>
+      </w:r>
+      <w:proofErr w:type="spellStart"/>
+      <w:r>
+        <w:t>CancellationToken</w:t>
+      </w:r>
+      <w:proofErr w:type="spellEnd"/>
+      <w:r>
+        <w:t>. ASP.NET Core creates a token that's linked to the request and automatically cancels it if the client disconnects or the request is aborted. The controller receives this token and passes it through all layers so every asynchronous operation can observe the same cancellation request.</w:t>
+      </w:r>
+    </w:p>
+    <w:p>
+      <w:r>
+        <w:rPr>
+          <w:b/>
+          <w:bCs/>
+        </w:rPr>
+        <w:t xml:space="preserve">Why pass the same </w:t>
+      </w:r>
+      <w:proofErr w:type="spellStart"/>
+      <w:r>
+        <w:rPr>
+          <w:b/>
+          <w:bCs/>
+        </w:rPr>
+        <w:t>CancellationToken</w:t>
+      </w:r>
+      <w:proofErr w:type="spellEnd"/>
+      <w:r>
+        <w:rPr>
+          <w:b/>
+          <w:bCs/>
+        </w:rPr>
+        <w:t xml:space="preserve"> to every async operation?</w:t>
+      </w:r>
+    </w:p>
+    <w:p>
+      <w:r>
+        <w:t xml:space="preserve">Each asynchronous operation may take a significant amount of time independently. By propagating the same </w:t>
+      </w:r>
+      <w:proofErr w:type="spellStart"/>
+      <w:r>
+        <w:t>CancellationToken</w:t>
+      </w:r>
+      <w:proofErr w:type="spellEnd"/>
+      <w:r>
+        <w:t xml:space="preserve"> through every async method, each operation can stop as soon as cancellation is requested. This avoids wasting CPU, database connections, and other resources after the client has already disconnected.</w:t>
       </w:r>
     </w:p>
     <w:p/>
@@ -764,7 +863,7 @@
 </file>
 
 <file path=word/numbering.xml><?xml version="1.0" encoding="utf-8"?>
-<w:numbering xmlns:wpc="http://schemas.microsoft.com/office/word/2010/wordprocessingCanvas" xmlns:cx="http://schemas.microsoft.com/office/drawing/2014/chartex" xmlns:cx1="http://schemas.microsoft.com/office/drawing/2015/9/8/chartex" xmlns:cx2="http://schemas.microsoft.com/office/drawing/2015/10/21/chartex" xmlns:cx3="http://schemas.microsoft.com/office/drawing/2016/5/9/chartex" xmlns:cx4="http://schemas.microsoft.com/office/drawing/2016/5/10/chartex" xmlns:cx5="http://schemas.microsoft.com/office/drawing/2016/5/11/chartex" xmlns:cx6="http://schemas.microsoft.com/office/drawing/2016/5/12/chartex" xmlns:cx7="http://schemas.microsoft.com/office/drawing/2016/5/13/chartex" xmlns:cx8="http://schemas.microsoft.com/office/drawing/2016/5/14/chartex" xmlns:mc="http://schemas.openxmlformats.org/markup-compatibility/2006" xmlns:aink="http://schemas.microsoft.com/office/drawing/2016/ink" xmlns:am3d="http://schemas.microsoft.com/office/drawing/2017/model3d" xmlns:o="urn:schemas-microsoft-com:office:office" xmlns:oel="http://schemas.microsoft.com/office/2019/extlst" xmlns:r="http://schemas.openxmlformats.org/officeDocument/2006/relationships" xmlns:m="http://schemas.openxmlformats.org/officeDocument/2006/math" xmlns:v="urn:schemas-microsoft-com:vml" xmlns:wp14="http://schemas.microsoft.com/office/word/2010/wordprocessingDrawing" xmlns:wp="http://schemas.openxmlformats.org/drawingml/2006/wordprocessingDrawing" xmlns:w10="urn:schemas-microsoft-com:office:word" xmlns:w="http://schemas.openxmlformats.org/wordprocessingml/2006/main" xmlns:w14="http://schemas.microsoft.com/office/word/2010/wordml" xmlns:w15="http://schemas.microsoft.com/office/word/2012/wordml" xmlns:w16cex="http://schemas.microsoft.com/office/word/2018/wordml/cex" xmlns:w16cid="http://schemas.microsoft.com/office/word/2016/wordml/cid" xmlns:w16="http://schemas.microsoft.com/office/word/2018/wordml" xmlns:w16du="http://schemas.microsoft.com/office/word/2023/wordml/word16du" xmlns:w16sdtdh="http://schemas.microsoft.com/office/word/2020/wordml/sdtdatahash" xmlns:w16sdtfl="http://schemas.microsoft.com/office/word/2024/wordml/sdtformatlock" xmlns:w16se="http://schemas.microsoft.com/office/word/2015/wordml/symex" xmlns:wpg="http://schemas.microsoft.com/office/word/2010/wordprocessingGroup" xmlns:wpi="http://schemas.microsoft.com/office/word/2010/wordprocessingInk" xmlns:wne="http://schemas.microsoft.com/office/word/2006/wordml" xmlns:wps="http://schemas.microsoft.com/office/word/2010/wordprocessingShape" mc:Ignorable="w14 w15 w16se w16cid w16 w16cex w16sdtdh w16sdtfl w16du wp14">
+<w:numbering xmlns:wpc="http://schemas.microsoft.com/office/word/2010/wordprocessingCanvas" xmlns:cx="http://schemas.microsoft.com/office/drawing/2014/chartex" xmlns:cx1="http://schemas.microsoft.com/office/drawing/2015/9/8/chartex" xmlns:cx2="http://schemas.microsoft.com/office/drawing/2015/10/21/chartex" xmlns:cx3="http://schemas.microsoft.com/office/drawing/2016/5/9/chartex" xmlns:cx4="http://schemas.microsoft.com/office/drawing/2016/5/10/chartex" xmlns:cx5="http://schemas.microsoft.com/office/drawing/2016/5/11/chartex" xmlns:cx6="http://schemas.microsoft.com/office/drawing/2016/5/12/chartex" xmlns:cx7="http://schemas.microsoft.com/office/drawing/2016/5/13/chartex" xmlns:cx8="http://schemas.microsoft.com/office/drawing/2016/5/14/chartex" xmlns:mc="http://schemas.openxmlformats.org/markup-compatibility/2006" xmlns:aink="http://schemas.microsoft.com/office/drawing/2016/ink" xmlns:am3d="http://schemas.microsoft.com/office/drawing/2017/model3d" xmlns:o="urn:schemas-microsoft-com:office:office" xmlns:oel="http://schemas.microsoft.com/office/2019/extlst" xmlns:r="http://schemas.openxmlformats.org/officeDocument/2006/relationships" xmlns:m="http://schemas.openxmlformats.org/officeDocument/2006/math" xmlns:v="urn:schemas-microsoft-com:vml" xmlns:wp14="http://schemas.microsoft.com/office/word/2010/wordprocessingDrawing" xmlns:wp="http://schemas.openxmlformats.org/drawingml/2006/wordprocessingDrawing" xmlns:w10="urn:schemas-microsoft-com:office:word" xmlns:w="http://schemas.openxmlformats.org/wordprocessingml/2006/main" xmlns:w14="http://schemas.microsoft.com/office/word/2010/wordml" xmlns:w15="http://schemas.microsoft.com/office/word/2012/wordml" xmlns:w16cei="http://schemas.microsoft.com/office/word/2026/wordml/cei" xmlns:w16cex="http://schemas.microsoft.com/office/word/2018/wordml/cex" xmlns:w16cid="http://schemas.microsoft.com/office/word/2016/wordml/cid" xmlns:w16="http://schemas.microsoft.com/office/word/2018/wordml" xmlns:w16du="http://schemas.microsoft.com/office/word/2023/wordml/word16du" xmlns:w16sdtdh="http://schemas.microsoft.com/office/word/2020/wordml/sdtdatahash" xmlns:w16sdtfl="http://schemas.microsoft.com/office/word/2024/wordml/sdtformatlock" xmlns:w16se="http://schemas.microsoft.com/office/word/2015/wordml/symex" xmlns:wpg="http://schemas.microsoft.com/office/word/2010/wordprocessingGroup" xmlns:wpi="http://schemas.microsoft.com/office/word/2010/wordprocessingInk" xmlns:wne="http://schemas.microsoft.com/office/word/2006/wordml" xmlns:wps="http://schemas.microsoft.com/office/word/2010/wordprocessingShape" mc:Ignorable="w14 w15 w16se w16cid w16 w16cex w16sdtdh w16sdtfl w16du wp14">
   <w:abstractNum w:abstractNumId="0" w15:restartNumberingAfterBreak="0">
     <w:nsid w:val="707E5912"/>
     <w:multiLevelType w:val="hybridMultilevel"/>
@@ -1819,6 +1918,36 @@
       </w:tblBorders>
     </w:tblPr>
   </w:style>
+  <w:style w:type="paragraph" w:styleId="NormalWeb">
+    <w:name w:val="Normal (Web)"/>
+    <w:basedOn w:val="Normal"/>
+    <w:uiPriority w:val="99"/>
+    <w:semiHidden/>
+    <w:unhideWhenUsed/>
+    <w:rsid w:val="00CB73CB"/>
+    <w:pPr>
+      <w:spacing w:before="100" w:beforeAutospacing="1" w:after="100" w:afterAutospacing="1" w:line="240" w:lineRule="auto"/>
+    </w:pPr>
+    <w:rPr>
+      <w:rFonts w:ascii="Times New Roman" w:eastAsia="Times New Roman" w:hAnsi="Times New Roman" w:cs="Times New Roman"/>
+      <w:kern w:val="0"/>
+      <w:sz w:val="24"/>
+      <w:szCs w:val="24"/>
+      <w:lang w:eastAsia="en-IN"/>
+      <w14:ligatures w14:val="none"/>
+    </w:rPr>
+  </w:style>
+  <w:style w:type="character" w:styleId="Strong">
+    <w:name w:val="Strong"/>
+    <w:basedOn w:val="DefaultParagraphFont"/>
+    <w:uiPriority w:val="22"/>
+    <w:qFormat/>
+    <w:rsid w:val="00CB73CB"/>
+    <w:rPr>
+      <w:b/>
+      <w:bCs/>
+    </w:rPr>
+  </w:style>
 </w:styles>
 </file>
 

</xml_diff>

<commit_message>
Added DTOs for Creating and Updating Employee Records
</commit_message>
<xml_diff>
--- a/notes.docx
+++ b/notes.docx
@@ -848,6 +848,449 @@
       <w:proofErr w:type="spellEnd"/>
       <w:r>
         <w:t xml:space="preserve"> through every async method, each operation can stop as soon as cancellation is requested. This avoids wasting CPU, database connections, and other resources after the client has already disconnected.</w:t>
+      </w:r>
+    </w:p>
+    <w:p>
+      <w:r>
+        <w:rPr>
+          <w:b/>
+          <w:bCs/>
+        </w:rPr>
+        <w:t xml:space="preserve">Why don't we create a </w:t>
+      </w:r>
+      <w:proofErr w:type="spellStart"/>
+      <w:r>
+        <w:rPr>
+          <w:b/>
+          <w:bCs/>
+        </w:rPr>
+        <w:t>DeleteEmployeeDto</w:t>
+      </w:r>
+      <w:proofErr w:type="spellEnd"/>
+      <w:r>
+        <w:rPr>
+          <w:b/>
+          <w:bCs/>
+        </w:rPr>
+        <w:t>?</w:t>
+      </w:r>
+    </w:p>
+    <w:p>
+      <w:r>
+        <w:t>A</w:t>
+      </w:r>
+      <w:r>
+        <w:t xml:space="preserve"> DTO is used to represent data transferred in the request or response body. A DELETE request typically identifies the resource through the route parameter, so there is no request body to model. If additional information were required in the body, then a DTO could be introduced, but for a standard RESTful DELETE operation, it isn't necessary.</w:t>
+      </w:r>
+    </w:p>
+    <w:tbl>
+      <w:tblPr>
+        <w:tblW w:w="8748" w:type="dxa"/>
+        <w:tblCellSpacing w:w="15" w:type="dxa"/>
+        <w:tblCellMar>
+          <w:top w:w="15" w:type="dxa"/>
+          <w:left w:w="15" w:type="dxa"/>
+          <w:bottom w:w="15" w:type="dxa"/>
+          <w:right w:w="15" w:type="dxa"/>
+        </w:tblCellMar>
+        <w:tblLook w:val="04A0" w:firstRow="1" w:lastRow="0" w:firstColumn="1" w:lastColumn="0" w:noHBand="0" w:noVBand="1"/>
+      </w:tblPr>
+      <w:tblGrid>
+        <w:gridCol w:w="3555"/>
+        <w:gridCol w:w="2661"/>
+        <w:gridCol w:w="2532"/>
+      </w:tblGrid>
+      <w:tr>
+        <w:trPr>
+          <w:trHeight w:val="453"/>
+          <w:tblHeader/>
+          <w:tblCellSpacing w:w="15" w:type="dxa"/>
+        </w:trPr>
+        <w:tc>
+          <w:tcPr>
+            <w:tcW w:w="0" w:type="auto"/>
+            <w:vAlign w:val="center"/>
+            <w:hideMark/>
+          </w:tcPr>
+          <w:p>
+            <w:pPr>
+              <w:rPr>
+                <w:b/>
+                <w:bCs/>
+              </w:rPr>
+            </w:pPr>
+            <w:r>
+              <w:rPr>
+                <w:b/>
+                <w:bCs/>
+              </w:rPr>
+              <w:t>DTO</w:t>
+            </w:r>
+          </w:p>
+        </w:tc>
+        <w:tc>
+          <w:tcPr>
+            <w:tcW w:w="0" w:type="auto"/>
+            <w:vAlign w:val="center"/>
+            <w:hideMark/>
+          </w:tcPr>
+          <w:p>
+            <w:pPr>
+              <w:rPr>
+                <w:b/>
+                <w:bCs/>
+              </w:rPr>
+            </w:pPr>
+            <w:r>
+              <w:rPr>
+                <w:b/>
+                <w:bCs/>
+              </w:rPr>
+              <w:t>Direction</w:t>
+            </w:r>
+          </w:p>
+        </w:tc>
+        <w:tc>
+          <w:tcPr>
+            <w:tcW w:w="0" w:type="auto"/>
+            <w:vAlign w:val="center"/>
+            <w:hideMark/>
+          </w:tcPr>
+          <w:p>
+            <w:pPr>
+              <w:rPr>
+                <w:b/>
+                <w:bCs/>
+              </w:rPr>
+            </w:pPr>
+            <w:r>
+              <w:rPr>
+                <w:b/>
+                <w:bCs/>
+              </w:rPr>
+              <w:t>Validation?</w:t>
+            </w:r>
+          </w:p>
+        </w:tc>
+      </w:tr>
+      <w:tr>
+        <w:trPr>
+          <w:trHeight w:val="483"/>
+          <w:tblCellSpacing w:w="15" w:type="dxa"/>
+        </w:trPr>
+        <w:tc>
+          <w:tcPr>
+            <w:tcW w:w="0" w:type="auto"/>
+            <w:vAlign w:val="center"/>
+            <w:hideMark/>
+          </w:tcPr>
+          <w:p>
+            <w:proofErr w:type="spellStart"/>
+            <w:r>
+              <w:t>CreateEmployeeDto</w:t>
+            </w:r>
+            <w:proofErr w:type="spellEnd"/>
+          </w:p>
+        </w:tc>
+        <w:tc>
+          <w:tcPr>
+            <w:tcW w:w="0" w:type="auto"/>
+            <w:vAlign w:val="center"/>
+            <w:hideMark/>
+          </w:tcPr>
+          <w:p>
+            <w:r>
+              <w:t>Client → Server</w:t>
+            </w:r>
+          </w:p>
+        </w:tc>
+        <w:tc>
+          <w:tcPr>
+            <w:tcW w:w="0" w:type="auto"/>
+            <w:vAlign w:val="center"/>
+            <w:hideMark/>
+          </w:tcPr>
+          <w:p>
+            <w:r>
+              <w:rPr>
+                <w:rFonts w:ascii="Segoe UI Emoji" w:hAnsi="Segoe UI Emoji" w:cs="Segoe UI Emoji"/>
+              </w:rPr>
+              <w:t>✅</w:t>
+            </w:r>
+            <w:r>
+              <w:t xml:space="preserve"> Yes</w:t>
+            </w:r>
+          </w:p>
+        </w:tc>
+      </w:tr>
+      <w:tr>
+        <w:trPr>
+          <w:trHeight w:val="483"/>
+          <w:tblCellSpacing w:w="15" w:type="dxa"/>
+        </w:trPr>
+        <w:tc>
+          <w:tcPr>
+            <w:tcW w:w="0" w:type="auto"/>
+            <w:vAlign w:val="center"/>
+            <w:hideMark/>
+          </w:tcPr>
+          <w:p>
+            <w:proofErr w:type="spellStart"/>
+            <w:r>
+              <w:t>UpdateEmployeeDto</w:t>
+            </w:r>
+            <w:proofErr w:type="spellEnd"/>
+          </w:p>
+        </w:tc>
+        <w:tc>
+          <w:tcPr>
+            <w:tcW w:w="0" w:type="auto"/>
+            <w:vAlign w:val="center"/>
+            <w:hideMark/>
+          </w:tcPr>
+          <w:p>
+            <w:r>
+              <w:t>Client → Server</w:t>
+            </w:r>
+          </w:p>
+        </w:tc>
+        <w:tc>
+          <w:tcPr>
+            <w:tcW w:w="0" w:type="auto"/>
+            <w:vAlign w:val="center"/>
+            <w:hideMark/>
+          </w:tcPr>
+          <w:p>
+            <w:r>
+              <w:rPr>
+                <w:rFonts w:ascii="Segoe UI Emoji" w:hAnsi="Segoe UI Emoji" w:cs="Segoe UI Emoji"/>
+              </w:rPr>
+              <w:t>✅</w:t>
+            </w:r>
+            <w:r>
+              <w:t xml:space="preserve"> Yes</w:t>
+            </w:r>
+          </w:p>
+        </w:tc>
+      </w:tr>
+      <w:tr>
+        <w:trPr>
+          <w:trHeight w:val="483"/>
+          <w:tblCellSpacing w:w="15" w:type="dxa"/>
+        </w:trPr>
+        <w:tc>
+          <w:tcPr>
+            <w:tcW w:w="0" w:type="auto"/>
+            <w:vAlign w:val="center"/>
+            <w:hideMark/>
+          </w:tcPr>
+          <w:p>
+            <w:proofErr w:type="spellStart"/>
+            <w:r>
+              <w:t>EmployeeDto</w:t>
+            </w:r>
+            <w:proofErr w:type="spellEnd"/>
+          </w:p>
+        </w:tc>
+        <w:tc>
+          <w:tcPr>
+            <w:tcW w:w="0" w:type="auto"/>
+            <w:vAlign w:val="center"/>
+            <w:hideMark/>
+          </w:tcPr>
+          <w:p>
+            <w:r>
+              <w:t>Server → Client</w:t>
+            </w:r>
+          </w:p>
+        </w:tc>
+        <w:tc>
+          <w:tcPr>
+            <w:tcW w:w="0" w:type="auto"/>
+            <w:vAlign w:val="center"/>
+            <w:hideMark/>
+          </w:tcPr>
+          <w:p>
+            <w:r>
+              <w:rPr>
+                <w:rFonts w:ascii="Segoe UI Emoji" w:hAnsi="Segoe UI Emoji" w:cs="Segoe UI Emoji"/>
+              </w:rPr>
+              <w:t>❌</w:t>
+            </w:r>
+            <w:r>
+              <w:t xml:space="preserve"> Usually No</w:t>
+            </w:r>
+          </w:p>
+        </w:tc>
+      </w:tr>
+    </w:tbl>
+    <w:p/>
+    <w:p>
+      <w:r>
+        <w:rPr>
+          <w:b/>
+          <w:bCs/>
+        </w:rPr>
+        <w:t>Should a Repository accept DTOs?</w:t>
+      </w:r>
+    </w:p>
+    <w:p>
+      <w:r>
+        <w:t>"Generally, no. DTOs belong to the presentation layer and represent the API contract. A repository should work with domain entities because its responsibility is persistence. The controller or service layer should map between DTOs and entities to keep the layers loosely coupled."</w:t>
+      </w:r>
+    </w:p>
+    <w:p/>
+    <w:p/>
+    <w:p>
+      <w:proofErr w:type="spellStart"/>
+      <w:r>
+        <w:lastRenderedPageBreak/>
+        <w:t>CreateEmployeeDto</w:t>
+      </w:r>
+      <w:proofErr w:type="spellEnd"/>
+    </w:p>
+    <w:p>
+      <w:r>
+        <w:t xml:space="preserve">        │</w:t>
+      </w:r>
+    </w:p>
+    <w:p>
+      <w:r>
+        <w:t xml:space="preserve">       </w:t>
+      </w:r>
+      <w:r>
+        <w:rPr>
+          <w:rFonts w:ascii="Arial" w:hAnsi="Arial" w:cs="Arial"/>
+        </w:rPr>
+        <w:t>▼</w:t>
+      </w:r>
+    </w:p>
+    <w:p>
+      <w:r>
+        <w:t>Controller</w:t>
+      </w:r>
+    </w:p>
+    <w:p>
+      <w:r>
+        <w:t xml:space="preserve">        │</w:t>
+      </w:r>
+    </w:p>
+    <w:p>
+      <w:r>
+        <w:t xml:space="preserve">  Mapping</w:t>
+      </w:r>
+    </w:p>
+    <w:p>
+      <w:r>
+        <w:t xml:space="preserve">       </w:t>
+      </w:r>
+      <w:r>
+        <w:rPr>
+          <w:rFonts w:ascii="Arial" w:hAnsi="Arial" w:cs="Arial"/>
+        </w:rPr>
+        <w:t>▼</w:t>
+      </w:r>
+    </w:p>
+    <w:p>
+      <w:r>
+        <w:t>Employee Entity</w:t>
+      </w:r>
+    </w:p>
+    <w:p>
+      <w:r>
+        <w:t xml:space="preserve">        │</w:t>
+      </w:r>
+    </w:p>
+    <w:p>
+      <w:r>
+        <w:t xml:space="preserve">       </w:t>
+      </w:r>
+      <w:r>
+        <w:rPr>
+          <w:rFonts w:ascii="Arial" w:hAnsi="Arial" w:cs="Arial"/>
+        </w:rPr>
+        <w:t>▼</w:t>
+      </w:r>
+    </w:p>
+    <w:p>
+      <w:r>
+        <w:t>Repository</w:t>
+      </w:r>
+    </w:p>
+    <w:p>
+      <w:r>
+        <w:t xml:space="preserve">        │</w:t>
+      </w:r>
+    </w:p>
+    <w:p>
+      <w:r>
+        <w:t xml:space="preserve">       </w:t>
+      </w:r>
+      <w:r>
+        <w:rPr>
+          <w:rFonts w:ascii="Arial" w:hAnsi="Arial" w:cs="Arial"/>
+        </w:rPr>
+        <w:t>▼</w:t>
+      </w:r>
+    </w:p>
+    <w:p>
+      <w:r>
+        <w:t>Employee Entity</w:t>
+      </w:r>
+    </w:p>
+    <w:p>
+      <w:r>
+        <w:t xml:space="preserve">        │</w:t>
+      </w:r>
+    </w:p>
+    <w:p>
+      <w:r>
+        <w:t xml:space="preserve">    Mapping</w:t>
+      </w:r>
+    </w:p>
+    <w:p>
+      <w:r>
+        <w:t xml:space="preserve">        </w:t>
+      </w:r>
+      <w:r>
+        <w:rPr>
+          <w:rFonts w:ascii="Arial" w:hAnsi="Arial" w:cs="Arial"/>
+        </w:rPr>
+        <w:t>▼</w:t>
+      </w:r>
+    </w:p>
+    <w:p>
+      <w:proofErr w:type="spellStart"/>
+      <w:r>
+        <w:t>EmployeeDto</w:t>
+      </w:r>
+      <w:proofErr w:type="spellEnd"/>
+    </w:p>
+    <w:p>
+      <w:r>
+        <w:t xml:space="preserve">        │</w:t>
+      </w:r>
+    </w:p>
+    <w:p>
+      <w:r>
+        <w:t xml:space="preserve">        </w:t>
+      </w:r>
+      <w:r>
+        <w:rPr>
+          <w:rFonts w:ascii="Arial" w:hAnsi="Arial" w:cs="Arial"/>
+        </w:rPr>
+        <w:t>▼</w:t>
+      </w:r>
+    </w:p>
+    <w:p>
+      <w:r>
+        <w:t xml:space="preserve">     </w:t>
+      </w:r>
+      <w:r>
+        <w:t>Client</w:t>
+      </w:r>
+      <w:r>
+        <w:tab/>
       </w:r>
     </w:p>
     <w:p/>

</xml_diff>